<commit_message>
resolved template issue format
</commit_message>
<xml_diff>
--- a/resume_template_sample.docx
+++ b/resume_template_sample.docx
@@ -82,10 +82,64 @@
     </w:p>
     <w:p>
       <w:pPr>
-        <w:spacing w:before="40"/>
+        <w:pStyle w:val="NoSpacing"/>
         <w:jc w:val="center"/>
         <w:rPr>
           <w:rFonts w:asciiTheme="majorHAnsi" w:hAnsiTheme="majorHAnsi" w:cstheme="majorHAnsi"/>
+          <w:b/>
+          <w:bCs/>
+          <w:sz w:val="32"/>
+          <w:szCs w:val="32"/>
+        </w:rPr>
+      </w:pPr>
+      <w:r>
+        <w:rPr>
+          <w:rFonts w:asciiTheme="majorHAnsi" w:hAnsiTheme="majorHAnsi" w:cstheme="majorHAnsi"/>
+          <w:b/>
+          <w:bCs/>
+          <w:sz w:val="32"/>
+          <w:szCs w:val="32"/>
+        </w:rPr>
+        <w:t>&lt;1&gt;&lt;/1&gt;</w:t>
+      </w:r>
+    </w:p>
+    <w:p>
+      <w:pPr>
+        <w:pStyle w:val="NoSpacing"/>
+        <w:jc w:val="center"/>
+        <w:rPr>
+          <w:rFonts w:asciiTheme="majorHAnsi" w:hAnsiTheme="majorHAnsi" w:cstheme="majorHAnsi"/>
+          <w:b/>
+          <w:bCs/>
+          <w:sz w:val="32"/>
+          <w:szCs w:val="32"/>
+        </w:rPr>
+      </w:pPr>
+      <w:r>
+        <w:rPr>
+          <w:rFonts w:asciiTheme="majorHAnsi" w:hAnsiTheme="majorHAnsi" w:cstheme="majorHAnsi"/>
+          <w:b/>
+          <w:bCs/>
+          <w:sz w:val="32"/>
+          <w:szCs w:val="32"/>
+        </w:rPr>
+        <w:t>&lt;2&gt;&lt;/2&gt;</w:t>
+      </w:r>
+    </w:p>
+    <w:p>
+      <w:pPr>
+        <w:pStyle w:val="NoSpacing"/>
+        <w:jc w:val="center"/>
+      </w:pPr>
+    </w:p>
+    <w:p>
+      <w:pPr>
+        <w:rPr>
+          <w:rFonts w:asciiTheme="majorHAnsi" w:hAnsiTheme="majorHAnsi" w:cstheme="majorHAnsi"/>
+          <w:b/>
+          <w:color w:val="1F3A5F"/>
+          <w:sz w:val="24"/>
+          <w:szCs w:val="24"/>
         </w:rPr>
       </w:pPr>
       <w:r>
@@ -93,97 +147,14 @@
           <w:rFonts w:asciiTheme="majorHAnsi" w:hAnsiTheme="majorHAnsi" w:cstheme="majorHAnsi"/>
           <w:b/>
           <w:color w:val="1F3A5F"/>
-          <w:sz w:val="40"/>
+          <w:sz w:val="24"/>
+          <w:szCs w:val="24"/>
         </w:rPr>
-        <w:t>&lt;1&gt;&lt;/1&gt;</w:t>
+        <w:t>Professional Summary</w:t>
       </w:r>
     </w:p>
     <w:p>
       <w:pPr>
-        <w:spacing w:before="40"/>
-        <w:jc w:val="center"/>
-        <w:rPr>
-          <w:rFonts w:asciiTheme="majorHAnsi" w:hAnsiTheme="majorHAnsi" w:cstheme="majorHAnsi"/>
-        </w:rPr>
-      </w:pPr>
-      <w:r>
-        <w:rPr>
-          <w:rFonts w:asciiTheme="majorHAnsi" w:hAnsiTheme="majorHAnsi" w:cstheme="majorHAnsi"/>
-          <w:b/>
-          <w:color w:val="1F3A5F"/>
-          <w:sz w:val="40"/>
-        </w:rPr>
-        <w:t>&lt;</w:t>
-      </w:r>
-      <w:r>
-        <w:rPr>
-          <w:rFonts w:asciiTheme="majorHAnsi" w:hAnsiTheme="majorHAnsi" w:cstheme="majorHAnsi"/>
-          <w:b/>
-          <w:color w:val="1F3A5F"/>
-          <w:sz w:val="40"/>
-        </w:rPr>
-        <w:t>2</w:t>
-      </w:r>
-      <w:r>
-        <w:rPr>
-          <w:rFonts w:asciiTheme="majorHAnsi" w:hAnsiTheme="majorHAnsi" w:cstheme="majorHAnsi"/>
-          <w:b/>
-          <w:color w:val="1F3A5F"/>
-          <w:sz w:val="40"/>
-        </w:rPr>
-        <w:t>&gt;&lt;/</w:t>
-      </w:r>
-      <w:r>
-        <w:rPr>
-          <w:rFonts w:asciiTheme="majorHAnsi" w:hAnsiTheme="majorHAnsi" w:cstheme="majorHAnsi"/>
-          <w:b/>
-          <w:color w:val="1F3A5F"/>
-          <w:sz w:val="40"/>
-        </w:rPr>
-        <w:t>2</w:t>
-      </w:r>
-      <w:r>
-        <w:rPr>
-          <w:rFonts w:asciiTheme="majorHAnsi" w:hAnsiTheme="majorHAnsi" w:cstheme="majorHAnsi"/>
-          <w:b/>
-          <w:color w:val="1F3A5F"/>
-          <w:sz w:val="40"/>
-        </w:rPr>
-        <w:t>&gt;</w:t>
-      </w:r>
-    </w:p>
-    <w:p>
-      <w:pPr>
-        <w:pBdr>
-          <w:bottom w:val="single" w:sz="6" w:space="0" w:color="1F3A5F"/>
-        </w:pBdr>
-        <w:spacing w:before="240" w:after="80"/>
-        <w:rPr>
-          <w:rFonts w:asciiTheme="majorHAnsi" w:hAnsiTheme="majorHAnsi" w:cstheme="majorHAnsi"/>
-          <w:b/>
-          <w:color w:val="1F3A5F"/>
-        </w:rPr>
-      </w:pPr>
-      <w:r>
-        <w:rPr>
-          <w:rFonts w:asciiTheme="majorHAnsi" w:hAnsiTheme="majorHAnsi" w:cstheme="majorHAnsi"/>
-          <w:b/>
-          <w:color w:val="1F3A5F"/>
-        </w:rPr>
-        <w:t xml:space="preserve">PROFESSIONAL </w:t>
-      </w:r>
-      <w:r>
-        <w:rPr>
-          <w:rFonts w:asciiTheme="majorHAnsi" w:hAnsiTheme="majorHAnsi" w:cstheme="majorHAnsi"/>
-          <w:b/>
-          <w:color w:val="1F3A5F"/>
-        </w:rPr>
-        <w:t>SUMMARY</w:t>
-      </w:r>
-    </w:p>
-    <w:p>
-      <w:pPr>
-        <w:spacing w:after="40"/>
         <w:rPr>
           <w:rFonts w:asciiTheme="majorHAnsi" w:hAnsiTheme="majorHAnsi" w:cstheme="majorHAnsi"/>
         </w:rPr>
@@ -227,14 +198,12 @@
     </w:p>
     <w:p>
       <w:pPr>
-        <w:pBdr>
-          <w:bottom w:val="single" w:sz="6" w:space="0" w:color="1F3A5F"/>
-        </w:pBdr>
-        <w:spacing w:before="240" w:after="80"/>
         <w:rPr>
           <w:rFonts w:asciiTheme="majorHAnsi" w:hAnsiTheme="majorHAnsi" w:cstheme="majorHAnsi"/>
           <w:b/>
           <w:color w:val="1F3A5F"/>
+          <w:sz w:val="24"/>
+          <w:szCs w:val="24"/>
         </w:rPr>
       </w:pPr>
       <w:r>
@@ -242,13 +211,14 @@
           <w:rFonts w:asciiTheme="majorHAnsi" w:hAnsiTheme="majorHAnsi" w:cstheme="majorHAnsi"/>
           <w:b/>
           <w:color w:val="1F3A5F"/>
+          <w:sz w:val="24"/>
+          <w:szCs w:val="24"/>
         </w:rPr>
-        <w:t>CERTIFICATIONS</w:t>
+        <w:t>Certifications</w:t>
       </w:r>
     </w:p>
     <w:p>
       <w:pPr>
-        <w:spacing w:after="40"/>
         <w:rPr>
           <w:rFonts w:asciiTheme="majorHAnsi" w:hAnsiTheme="majorHAnsi" w:cstheme="majorHAnsi"/>
         </w:rPr>
@@ -274,10 +244,132 @@
     </w:p>
     <w:p>
       <w:pPr>
-        <w:pBdr>
-          <w:bottom w:val="single" w:sz="6" w:space="0" w:color="1F3A5F"/>
-        </w:pBdr>
-        <w:spacing w:before="240" w:after="80"/>
+        <w:rPr>
+          <w:rFonts w:asciiTheme="majorHAnsi" w:hAnsiTheme="majorHAnsi" w:cstheme="majorHAnsi"/>
+          <w:b/>
+          <w:color w:val="1F3A5F"/>
+          <w:sz w:val="24"/>
+          <w:szCs w:val="24"/>
+        </w:rPr>
+      </w:pPr>
+      <w:r>
+        <w:rPr>
+          <w:rFonts w:asciiTheme="majorHAnsi" w:hAnsiTheme="majorHAnsi" w:cstheme="majorHAnsi"/>
+          <w:b/>
+          <w:color w:val="1F3A5F"/>
+          <w:sz w:val="24"/>
+          <w:szCs w:val="24"/>
+        </w:rPr>
+        <w:t>Technical Skills</w:t>
+      </w:r>
+    </w:p>
+    <w:p>
+      <w:pPr>
+        <w:pStyle w:val="NoSpacing"/>
+        <w:rPr>
+          <w:rFonts w:asciiTheme="majorHAnsi" w:hAnsiTheme="majorHAnsi" w:cstheme="majorHAnsi"/>
+          <w:b/>
+          <w:bCs/>
+        </w:rPr>
+      </w:pPr>
+      <w:r>
+        <w:rPr>
+          <w:rFonts w:asciiTheme="majorHAnsi" w:hAnsiTheme="majorHAnsi" w:cstheme="majorHAnsi"/>
+          <w:b/>
+          <w:bCs/>
+        </w:rPr>
+        <w:t>&lt;b&gt;</w:t>
+      </w:r>
+      <w:r>
+        <w:rPr>
+          <w:rFonts w:asciiTheme="majorHAnsi" w:hAnsiTheme="majorHAnsi" w:cstheme="majorHAnsi"/>
+          <w:b/>
+          <w:bCs/>
+        </w:rPr>
+        <w:t>Primary Tools</w:t>
+      </w:r>
+      <w:r>
+        <w:rPr>
+          <w:rFonts w:asciiTheme="majorHAnsi" w:hAnsiTheme="majorHAnsi" w:cstheme="majorHAnsi"/>
+          <w:b/>
+          <w:bCs/>
+        </w:rPr>
+        <w:t>&lt;/b&gt;</w:t>
+      </w:r>
+      <w:r>
+        <w:rPr>
+          <w:rFonts w:asciiTheme="majorHAnsi" w:hAnsiTheme="majorHAnsi" w:cstheme="majorHAnsi"/>
+          <w:b/>
+          <w:bCs/>
+        </w:rPr>
+        <w:t xml:space="preserve">: </w:t>
+      </w:r>
+      <w:r>
+        <w:rPr>
+          <w:rFonts w:asciiTheme="majorHAnsi" w:hAnsiTheme="majorHAnsi" w:cstheme="majorHAnsi"/>
+        </w:rPr>
+        <w:t>&lt;4&gt;&lt;/4&gt;</w:t>
+      </w:r>
+    </w:p>
+    <w:p>
+      <w:pPr>
+        <w:pStyle w:val="NoSpacing"/>
+        <w:rPr>
+          <w:rFonts w:asciiTheme="majorHAnsi" w:hAnsiTheme="majorHAnsi" w:cstheme="majorHAnsi"/>
+          <w:b/>
+          <w:bCs/>
+        </w:rPr>
+      </w:pPr>
+      <w:r>
+        <w:rPr>
+          <w:rFonts w:asciiTheme="majorHAnsi" w:hAnsiTheme="majorHAnsi" w:cstheme="majorHAnsi"/>
+          <w:b/>
+          <w:bCs/>
+        </w:rPr>
+        <w:t>&lt;b&gt;</w:t>
+      </w:r>
+      <w:r>
+        <w:rPr>
+          <w:rFonts w:asciiTheme="majorHAnsi" w:hAnsiTheme="majorHAnsi" w:cstheme="majorHAnsi"/>
+          <w:b/>
+          <w:bCs/>
+        </w:rPr>
+        <w:t>Cloud &amp; Infrastructure</w:t>
+      </w:r>
+      <w:r>
+        <w:rPr>
+          <w:rFonts w:asciiTheme="majorHAnsi" w:hAnsiTheme="majorHAnsi" w:cstheme="majorHAnsi"/>
+          <w:b/>
+          <w:bCs/>
+        </w:rPr>
+        <w:t>&lt;/b&gt;</w:t>
+      </w:r>
+      <w:r>
+        <w:rPr>
+          <w:rFonts w:asciiTheme="majorHAnsi" w:hAnsiTheme="majorHAnsi" w:cstheme="majorHAnsi"/>
+          <w:b/>
+          <w:bCs/>
+        </w:rPr>
+        <w:t>:</w:t>
+      </w:r>
+      <w:r>
+        <w:rPr>
+          <w:rFonts w:asciiTheme="majorHAnsi" w:hAnsiTheme="majorHAnsi" w:cstheme="majorHAnsi"/>
+          <w:b/>
+          <w:bCs/>
+        </w:rPr>
+        <w:t xml:space="preserve"> </w:t>
+      </w:r>
+      <w:r>
+        <w:rPr>
+          <w:rFonts w:asciiTheme="majorHAnsi" w:hAnsiTheme="majorHAnsi" w:cstheme="majorHAnsi"/>
+        </w:rPr>
+        <w:t>&lt;5&gt;&lt;/5&gt;</w:t>
+      </w:r>
+    </w:p>
+    <w:p>
+      <w:pPr>
+        <w:pStyle w:val="NoSpacing"/>
         <w:rPr>
           <w:rFonts w:asciiTheme="majorHAnsi" w:hAnsiTheme="majorHAnsi" w:cstheme="majorHAnsi"/>
         </w:rPr>
@@ -286,23 +378,7 @@
         <w:rPr>
           <w:rFonts w:asciiTheme="majorHAnsi" w:hAnsiTheme="majorHAnsi" w:cstheme="majorHAnsi"/>
           <w:b/>
-          <w:color w:val="1F3A5F"/>
-        </w:rPr>
-        <w:t>TECHNICAL SKILLS</w:t>
-      </w:r>
-    </w:p>
-    <w:p>
-      <w:pPr>
-        <w:spacing w:after="40"/>
-        <w:rPr>
-          <w:rFonts w:asciiTheme="majorHAnsi" w:hAnsiTheme="majorHAnsi" w:cstheme="majorHAnsi"/>
-        </w:rPr>
-      </w:pPr>
-      <w:r>
-        <w:rPr>
-          <w:rFonts w:asciiTheme="majorHAnsi" w:hAnsiTheme="majorHAnsi" w:cstheme="majorHAnsi"/>
-          <w:b/>
-          <w:sz w:val="20"/>
+          <w:bCs/>
         </w:rPr>
         <w:t>&lt;b&gt;</w:t>
       </w:r>
@@ -310,141 +386,7 @@
         <w:rPr>
           <w:rFonts w:asciiTheme="majorHAnsi" w:hAnsiTheme="majorHAnsi" w:cstheme="majorHAnsi"/>
           <w:b/>
-          <w:sz w:val="20"/>
-        </w:rPr>
-        <w:t>Primary Tools</w:t>
-      </w:r>
-      <w:r>
-        <w:rPr>
-          <w:rFonts w:asciiTheme="majorHAnsi" w:hAnsiTheme="majorHAnsi" w:cstheme="majorHAnsi"/>
-          <w:b/>
-          <w:sz w:val="20"/>
-        </w:rPr>
-        <w:t>&lt;</w:t>
-      </w:r>
-      <w:r>
-        <w:rPr>
-          <w:rFonts w:asciiTheme="majorHAnsi" w:hAnsiTheme="majorHAnsi" w:cstheme="majorHAnsi"/>
-          <w:b/>
-          <w:sz w:val="20"/>
-        </w:rPr>
-        <w:t>/</w:t>
-      </w:r>
-      <w:r>
-        <w:rPr>
-          <w:rFonts w:asciiTheme="majorHAnsi" w:hAnsiTheme="majorHAnsi" w:cstheme="majorHAnsi"/>
-          <w:b/>
-          <w:sz w:val="20"/>
-        </w:rPr>
-        <w:t>b&gt;</w:t>
-      </w:r>
-      <w:r>
-        <w:rPr>
-          <w:rFonts w:asciiTheme="majorHAnsi" w:hAnsiTheme="majorHAnsi" w:cstheme="majorHAnsi"/>
-          <w:b/>
-          <w:sz w:val="20"/>
-        </w:rPr>
-        <w:t xml:space="preserve">: </w:t>
-      </w:r>
-      <w:r>
-        <w:rPr>
-          <w:rFonts w:asciiTheme="majorHAnsi" w:hAnsiTheme="majorHAnsi" w:cstheme="majorHAnsi"/>
-          <w:sz w:val="20"/>
-        </w:rPr>
-        <w:t>&lt;4&gt;&lt;/4&gt;</w:t>
-      </w:r>
-    </w:p>
-    <w:p>
-      <w:pPr>
-        <w:spacing w:after="40"/>
-        <w:rPr>
-          <w:rFonts w:asciiTheme="majorHAnsi" w:hAnsiTheme="majorHAnsi" w:cstheme="majorHAnsi"/>
-        </w:rPr>
-      </w:pPr>
-      <w:r>
-        <w:rPr>
-          <w:rFonts w:asciiTheme="majorHAnsi" w:hAnsiTheme="majorHAnsi" w:cstheme="majorHAnsi"/>
-          <w:b/>
-          <w:sz w:val="20"/>
-        </w:rPr>
-        <w:t>&lt;b&gt;</w:t>
-      </w:r>
-      <w:r>
-        <w:rPr>
-          <w:rFonts w:asciiTheme="majorHAnsi" w:hAnsiTheme="majorHAnsi" w:cstheme="majorHAnsi"/>
-          <w:b/>
-          <w:sz w:val="20"/>
-        </w:rPr>
-        <w:t>Cloud &amp; Infrastructure</w:t>
-      </w:r>
-      <w:r>
-        <w:rPr>
-          <w:rFonts w:asciiTheme="majorHAnsi" w:hAnsiTheme="majorHAnsi" w:cstheme="majorHAnsi"/>
-          <w:b/>
-          <w:sz w:val="20"/>
-        </w:rPr>
-        <w:t>&lt;</w:t>
-      </w:r>
-      <w:r>
-        <w:rPr>
-          <w:rFonts w:asciiTheme="majorHAnsi" w:hAnsiTheme="majorHAnsi" w:cstheme="majorHAnsi"/>
-          <w:b/>
-          <w:sz w:val="20"/>
-        </w:rPr>
-        <w:t>/</w:t>
-      </w:r>
-      <w:r>
-        <w:rPr>
-          <w:rFonts w:asciiTheme="majorHAnsi" w:hAnsiTheme="majorHAnsi" w:cstheme="majorHAnsi"/>
-          <w:b/>
-          <w:sz w:val="20"/>
-        </w:rPr>
-        <w:t>b&gt;</w:t>
-      </w:r>
-      <w:r>
-        <w:rPr>
-          <w:rFonts w:asciiTheme="majorHAnsi" w:hAnsiTheme="majorHAnsi" w:cstheme="majorHAnsi"/>
-          <w:b/>
-          <w:sz w:val="20"/>
-        </w:rPr>
-        <w:t>:</w:t>
-      </w:r>
-      <w:r>
-        <w:rPr>
-          <w:rFonts w:asciiTheme="majorHAnsi" w:hAnsiTheme="majorHAnsi" w:cstheme="majorHAnsi"/>
-          <w:b/>
-          <w:sz w:val="20"/>
-        </w:rPr>
-        <w:t xml:space="preserve"> </w:t>
-      </w:r>
-      <w:r>
-        <w:rPr>
-          <w:rFonts w:asciiTheme="majorHAnsi" w:hAnsiTheme="majorHAnsi" w:cstheme="majorHAnsi"/>
-          <w:sz w:val="20"/>
-        </w:rPr>
-        <w:t>&lt;5&gt;&lt;/5&gt;</w:t>
-      </w:r>
-    </w:p>
-    <w:p>
-      <w:pPr>
-        <w:spacing w:after="40"/>
-        <w:rPr>
-          <w:rFonts w:asciiTheme="majorHAnsi" w:hAnsiTheme="majorHAnsi" w:cstheme="majorHAnsi"/>
-        </w:rPr>
-      </w:pPr>
-      <w:r>
-        <w:rPr>
-          <w:rFonts w:asciiTheme="majorHAnsi" w:hAnsiTheme="majorHAnsi" w:cstheme="majorHAnsi"/>
-          <w:b/>
-          <w:sz w:val="20"/>
-        </w:rPr>
-        <w:t>&lt;b&gt;</w:t>
-      </w:r>
-      <w:r>
-        <w:rPr>
-          <w:rFonts w:asciiTheme="majorHAnsi" w:hAnsiTheme="majorHAnsi" w:cstheme="majorHAnsi"/>
-          <w:b/>
-          <w:sz w:val="20"/>
+          <w:bCs/>
         </w:rPr>
         <w:t>Other Skills</w:t>
       </w:r>
@@ -452,80 +394,65 @@
         <w:rPr>
           <w:rFonts w:asciiTheme="majorHAnsi" w:hAnsiTheme="majorHAnsi" w:cstheme="majorHAnsi"/>
           <w:b/>
-          <w:sz w:val="20"/>
+          <w:bCs/>
+        </w:rPr>
+        <w:t>&lt;/b&gt;</w:t>
+      </w:r>
+      <w:r>
+        <w:rPr>
+          <w:rFonts w:asciiTheme="majorHAnsi" w:hAnsiTheme="majorHAnsi" w:cstheme="majorHAnsi"/>
+          <w:b/>
+          <w:bCs/>
+        </w:rPr>
+        <w:t xml:space="preserve">: </w:t>
+      </w:r>
+      <w:r>
+        <w:rPr>
+          <w:rFonts w:asciiTheme="majorHAnsi" w:hAnsiTheme="majorHAnsi" w:cstheme="majorHAnsi"/>
         </w:rPr>
         <w:t>&lt;</w:t>
       </w:r>
       <w:r>
         <w:rPr>
           <w:rFonts w:asciiTheme="majorHAnsi" w:hAnsiTheme="majorHAnsi" w:cstheme="majorHAnsi"/>
-          <w:b/>
-          <w:sz w:val="20"/>
-        </w:rPr>
-        <w:t>/</w:t>
-      </w:r>
-      <w:r>
-        <w:rPr>
-          <w:rFonts w:asciiTheme="majorHAnsi" w:hAnsiTheme="majorHAnsi" w:cstheme="majorHAnsi"/>
-          <w:b/>
-          <w:sz w:val="20"/>
-        </w:rPr>
-        <w:t>b&gt;</w:t>
-      </w:r>
-      <w:r>
-        <w:rPr>
-          <w:rFonts w:asciiTheme="majorHAnsi" w:hAnsiTheme="majorHAnsi" w:cstheme="majorHAnsi"/>
-          <w:b/>
-          <w:sz w:val="20"/>
-        </w:rPr>
-        <w:t xml:space="preserve">: </w:t>
-      </w:r>
-      <w:r>
-        <w:rPr>
-          <w:rFonts w:asciiTheme="majorHAnsi" w:hAnsiTheme="majorHAnsi" w:cstheme="majorHAnsi"/>
-          <w:sz w:val="20"/>
-        </w:rPr>
-        <w:t>&lt;</w:t>
-      </w:r>
-      <w:r>
-        <w:rPr>
-          <w:rFonts w:asciiTheme="majorHAnsi" w:hAnsiTheme="majorHAnsi" w:cstheme="majorHAnsi"/>
-          <w:sz w:val="20"/>
         </w:rPr>
         <w:t>6</w:t>
       </w:r>
       <w:r>
         <w:rPr>
           <w:rFonts w:asciiTheme="majorHAnsi" w:hAnsiTheme="majorHAnsi" w:cstheme="majorHAnsi"/>
-          <w:sz w:val="20"/>
         </w:rPr>
         <w:t>&gt;&lt;/</w:t>
       </w:r>
       <w:r>
         <w:rPr>
           <w:rFonts w:asciiTheme="majorHAnsi" w:hAnsiTheme="majorHAnsi" w:cstheme="majorHAnsi"/>
-          <w:sz w:val="20"/>
         </w:rPr>
         <w:t>6</w:t>
       </w:r>
       <w:r>
         <w:rPr>
           <w:rFonts w:asciiTheme="majorHAnsi" w:hAnsiTheme="majorHAnsi" w:cstheme="majorHAnsi"/>
-          <w:sz w:val="20"/>
         </w:rPr>
         <w:t>&gt;</w:t>
       </w:r>
     </w:p>
     <w:p>
       <w:pPr>
-        <w:pBdr>
-          <w:bottom w:val="single" w:sz="6" w:space="0" w:color="1F3A5F"/>
-        </w:pBdr>
-        <w:spacing w:before="240" w:after="80"/>
+        <w:pStyle w:val="NoSpacing"/>
+        <w:rPr>
+          <w:rFonts w:asciiTheme="majorHAnsi" w:hAnsiTheme="majorHAnsi" w:cstheme="majorHAnsi"/>
+        </w:rPr>
+      </w:pPr>
+    </w:p>
+    <w:p>
+      <w:pPr>
         <w:rPr>
           <w:rFonts w:asciiTheme="majorHAnsi" w:hAnsiTheme="majorHAnsi" w:cstheme="majorHAnsi"/>
           <w:b/>
           <w:color w:val="1F3A5F"/>
+          <w:sz w:val="24"/>
+          <w:szCs w:val="24"/>
         </w:rPr>
       </w:pPr>
       <w:r>
@@ -533,13 +460,14 @@
           <w:rFonts w:asciiTheme="majorHAnsi" w:hAnsiTheme="majorHAnsi" w:cstheme="majorHAnsi"/>
           <w:b/>
           <w:color w:val="1F3A5F"/>
+          <w:sz w:val="24"/>
+          <w:szCs w:val="24"/>
         </w:rPr>
-        <w:t>PROFESSIONAL EXPERIENCE</w:t>
+        <w:t>Professional Experience</w:t>
       </w:r>
     </w:p>
     <w:p>
       <w:pPr>
-        <w:spacing w:after="40"/>
         <w:rPr>
           <w:rFonts w:asciiTheme="majorHAnsi" w:hAnsiTheme="majorHAnsi" w:cstheme="majorHAnsi"/>
         </w:rPr>

</xml_diff>